<commit_message>
Add ELR assessments, system trends, and prioritized risk actions
Evidence tables now carry an assessment narrative (counts, implication,
CAPA, product or runtime impact). Access control and audit trail gain the
same narrative field. After discrepancies, two synthesis sections name
recurring themes across the period and a capped owned action list with an
overall Low/Medium/High grade. Word export splits 5.0 into 5.1–5.3 and
drops instructional template leftovers. Prompt version bumps to
mj-elr-sop-014-r04-v2 (invalidates ELR eval cache). No schema migration.

Co-authored-by: sachin.agrawal272 <sachin.agrawal272@gmail.com>
</commit_message>
<xml_diff>
--- a/templates/mj-equipment-lifecycle-report-template.docx
+++ b/templates/mj-equipment-lifecycle-report-template.docx
@@ -983,20 +983,6 @@
       </w:pPr>
       <w:r>
         <w:rPr>
-          <w:i/>
-          <w:iCs/>
-          <w:sz w:val="18"/>
-          <w:szCs w:val="18"/>
-        </w:rPr>
-        <w:t xml:space="preserve">Cumulative for the full life of the equipment — this section is not limited to the ELR period. List every stage from the user requirement specification through to the most recent periodic re-qualification, in chronological order, including the requirement traceability matrix and any qualification discrepancy raised. Mark each row Vial, Cartridge or Line-common.</w:t>
-      </w:r>
-    </w:p>
-    <w:p>
-      <w:pPr>
-        <w:spacing w:before="80" w:after="80"/>
-      </w:pPr>
-      <w:r>
-        <w:rPr>
           <w:sz w:val="20"/>
           <w:szCs w:val="20"/>
         </w:rPr>
@@ -1035,20 +1021,6 @@
       </w:pPr>
       <w:r>
         <w:rPr>
-          <w:i/>
-          <w:iCs/>
-          <w:sz w:val="18"/>
-          <w:szCs w:val="18"/>
-        </w:rPr>
-        <w:t xml:space="preserve">Aseptic process simulations covering this equipment and container format. Confirm that the qualifying configuration remains current and that the required frequency per line and per shift has been met.</w:t>
-      </w:r>
-    </w:p>
-    <w:p>
-      <w:pPr>
-        <w:spacing w:before="80" w:after="80"/>
-      </w:pPr>
-      <w:r>
-        <w:rPr>
           <w:sz w:val="20"/>
           <w:szCs w:val="20"/>
         </w:rPr>
@@ -1087,20 +1059,6 @@
       </w:pPr>
       <w:r>
         <w:rPr>
-          <w:i/>
-          <w:iCs/>
-          <w:sz w:val="18"/>
-          <w:szCs w:val="18"/>
-        </w:rPr>
-        <w:t xml:space="preserve">Environmental, process-parameter and utility monitoring for the ELR period. Any excursion must be cross-referenced against Section 11.</w:t>
-      </w:r>
-    </w:p>
-    <w:p>
-      <w:pPr>
-        <w:spacing w:before="80" w:after="80"/>
-      </w:pPr>
-      <w:r>
-        <w:rPr>
           <w:sz w:val="20"/>
           <w:szCs w:val="20"/>
         </w:rPr>
@@ -1139,20 +1097,6 @@
       </w:pPr>
       <w:r>
         <w:rPr>
-          <w:i/>
-          <w:iCs/>
-          <w:sz w:val="18"/>
-          <w:szCs w:val="18"/>
-        </w:rPr>
-        <w:t xml:space="preserve">Instruments are identified by the equipment ID prefix in the annual calibration planner. Include instruments removed or replaced during the period, and state the current calibration status of every instrument presently fitted.</w:t>
-      </w:r>
-    </w:p>
-    <w:p>
-      <w:pPr>
-        <w:spacing w:before="80" w:after="80"/>
-      </w:pPr>
-      <w:r>
-        <w:rPr>
           <w:sz w:val="20"/>
           <w:szCs w:val="20"/>
         </w:rPr>
@@ -1191,20 +1135,6 @@
       </w:pPr>
       <w:r>
         <w:rPr>
-          <w:i/>
-          <w:iCs/>
-          <w:sz w:val="18"/>
-          <w:szCs w:val="18"/>
-        </w:rPr>
-        <w:t xml:space="preserve">Record PM compliance for the period. Where the PM checklist itself was revised during the period, state the revision and its change control or CAPA driver.</w:t>
-      </w:r>
-    </w:p>
-    <w:p>
-      <w:pPr>
-        <w:spacing w:before="80" w:after="80"/>
-      </w:pPr>
-      <w:r>
-        <w:rPr>
           <w:sz w:val="20"/>
           <w:szCs w:val="20"/>
         </w:rPr>
@@ -1307,20 +1237,6 @@
       </w:pPr>
       <w:r>
         <w:rPr>
-          <w:i/>
-          <w:iCs/>
-          <w:sz w:val="18"/>
-          <w:szCs w:val="18"/>
-        </w:rPr>
-        <w:t xml:space="preserve">The period rule for this section runs from the completion date of the last periodic re-qualification to the ELR cut-off date — not the rolling ELR window. List open items separately from closed ones.</w:t>
-      </w:r>
-    </w:p>
-    <w:p>
-      <w:pPr>
-        <w:spacing w:before="80" w:after="80"/>
-      </w:pPr>
-      <w:r>
-        <w:rPr>
           <w:sz w:val="20"/>
           <w:szCs w:val="20"/>
         </w:rPr>
@@ -1359,20 +1275,6 @@
       </w:pPr>
       <w:r>
         <w:rPr>
-          <w:i/>
-          <w:iCs/>
-          <w:sz w:val="18"/>
-          <w:szCs w:val="18"/>
-        </w:rPr>
-        <w:t xml:space="preserve">Compiled from the approved alarm trend reports covering the ELR period. State whether the set of alarm codes under trend remains appropriate to the direct-impact functions of the equipment.</w:t>
-      </w:r>
-    </w:p>
-    <w:p>
-      <w:pPr>
-        <w:spacing w:before="80" w:after="80"/>
-      </w:pPr>
-      <w:r>
-        <w:rPr>
           <w:sz w:val="20"/>
           <w:szCs w:val="20"/>
         </w:rPr>
@@ -1437,12 +1339,10 @@
       </w:pPr>
       <w:r>
         <w:rPr>
-          <w:i/>
-          <w:iCs/>
-          <w:sz w:val="18"/>
-          <w:szCs w:val="18"/>
+          <w:sz w:val="20"/>
+          <w:szCs w:val="20"/>
         </w:rPr>
-        <w:t xml:space="preserve">Sections 3.12 and 3.13 are completed for every computerized system associated with the equipment. Where the system is shared across several machines on the line, scope the review to this equipment where the system permits and mark the remainder Line-common. State “Not Applicable” explicitly if the equipment has no associated computerized system.</w:t>
+        <w:t xml:space="preserve">{@accessControlXml}</w:t>
       </w:r>
     </w:p>
     <w:p>
@@ -1480,6 +1380,18 @@
           <w:sz w:val="20"/>
           <w:szCs w:val="20"/>
         </w:rPr>
+        <w:t xml:space="preserve">{@auditTrailXml}</w:t>
+      </w:r>
+    </w:p>
+    <w:p>
+      <w:pPr>
+        <w:spacing w:before="80" w:after="80"/>
+      </w:pPr>
+      <w:r>
+        <w:rPr>
+          <w:sz w:val="20"/>
+          <w:szCs w:val="20"/>
+        </w:rPr>
         <w:t xml:space="preserve">{@auditTrailTableXml}</w:t>
       </w:r>
     </w:p>
@@ -1541,20 +1453,6 @@
       </w:pPr>
       <w:r>
         <w:rPr>
-          <w:i/>
-          <w:iCs/>
-          <w:sz w:val="18"/>
-          <w:szCs w:val="18"/>
-        </w:rPr>
-        <w:t xml:space="preserve">Discrepancies observed while compiling this report — a record that could not be located, a reference that did not reconcile, an incomplete data set — with the disposition of each. State explicitly if none were observed.</w:t>
-      </w:r>
-    </w:p>
-    <w:p>
-      <w:pPr>
-        <w:spacing w:before="80" w:after="80"/>
-      </w:pPr>
-      <w:r>
-        <w:rPr>
           <w:sz w:val="20"/>
           <w:szCs w:val="20"/>
         </w:rPr>
@@ -1578,15 +1476,113 @@
     <w:p>
       <w:pPr>
         <w:spacing w:before="80" w:after="80"/>
+        <w:spacing w:before="200" w:after="80"/>
       </w:pPr>
       <w:r>
         <w:rPr>
-          <w:i/>
-          <w:iCs/>
-          <w:sz w:val="18"/>
-          <w:szCs w:val="18"/>
+          <w:b/>
+          <w:bCs/>
+          <w:sz w:val="22"/>
+          <w:szCs w:val="22"/>
         </w:rPr>
-        <w:t xml:space="preserve">State whether the equipment remains in its qualified state for this container format, on the basis of the evidence sections above.</w:t>
+        <w:t xml:space="preserve">5.1 SYSTEM TRENDS AND PATTERNS</w:t>
+      </w:r>
+    </w:p>
+    <w:p>
+      <w:pPr>
+        <w:spacing w:before="80" w:after="80"/>
+      </w:pPr>
+      <w:r>
+        <w:rPr>
+          <w:sz w:val="20"/>
+          <w:szCs w:val="20"/>
+        </w:rPr>
+        <w:t xml:space="preserve">{@systemTrendsXml}</w:t>
+      </w:r>
+    </w:p>
+    <w:p>
+      <w:pPr>
+        <w:spacing w:before="80" w:after="80"/>
+      </w:pPr>
+      <w:r>
+        <w:rPr>
+          <w:sz w:val="20"/>
+          <w:szCs w:val="20"/>
+        </w:rPr>
+        <w:t xml:space="preserve">{@systemTrendsTableXml}</w:t>
+      </w:r>
+    </w:p>
+    <w:p>
+      <w:pPr>
+        <w:spacing w:before="80" w:after="80"/>
+        <w:spacing w:before="200" w:after="80"/>
+      </w:pPr>
+      <w:r>
+        <w:rPr>
+          <w:b/>
+          <w:bCs/>
+          <w:sz w:val="22"/>
+          <w:szCs w:val="22"/>
+        </w:rPr>
+        <w:t xml:space="preserve">5.2 RISK ASSESSMENT AND PRIORITIZED ACTIONS</w:t>
+      </w:r>
+    </w:p>
+    <w:p>
+      <w:pPr>
+        <w:spacing w:before="80" w:after="80"/>
+      </w:pPr>
+      <w:r>
+        <w:rPr>
+          <w:sz w:val="20"/>
+          <w:szCs w:val="20"/>
+        </w:rPr>
+        <w:t xml:space="preserve">Overall report risk grading: </w:t>
+      </w:r>
+      <w:r>
+        <w:rPr>
+          <w:sz w:val="20"/>
+          <w:szCs w:val="20"/>
+        </w:rPr>
+        <w:t xml:space="preserve">{overallRiskGrade}</w:t>
+      </w:r>
+    </w:p>
+    <w:p>
+      <w:pPr>
+        <w:spacing w:before="80" w:after="80"/>
+      </w:pPr>
+      <w:r>
+        <w:rPr>
+          <w:sz w:val="20"/>
+          <w:szCs w:val="20"/>
+        </w:rPr>
+        <w:t xml:space="preserve">{@riskAssessmentXml}</w:t>
+      </w:r>
+    </w:p>
+    <w:p>
+      <w:pPr>
+        <w:spacing w:before="80" w:after="80"/>
+      </w:pPr>
+      <w:r>
+        <w:rPr>
+          <w:sz w:val="20"/>
+          <w:szCs w:val="20"/>
+        </w:rPr>
+        <w:t xml:space="preserve">{@riskActionsTableXml}</w:t>
+      </w:r>
+    </w:p>
+    <w:p>
+      <w:pPr>
+        <w:spacing w:before="80" w:after="80"/>
+        <w:spacing w:before="200" w:after="80"/>
+      </w:pPr>
+      <w:r>
+        <w:rPr>
+          <w:b/>
+          <w:bCs/>
+          <w:sz w:val="22"/>
+          <w:szCs w:val="22"/>
+        </w:rPr>
+        <w:t xml:space="preserve">5.3 CONCLUSION</w:t>
       </w:r>
     </w:p>
     <w:p>

</xml_diff>

<commit_message>
Tighten ELR assessment, contradiction, and risk-floor checks.
Require downtime, scrap, CAPA and qualified-state language in
assessments, bind QMS record types to citation prefixes, floor the
overall risk grade, print trend summaries before tables, and mark
F22 as a proposed form number.
</commit_message>
<xml_diff>
--- a/templates/mj-equipment-lifecycle-report-template.docx
+++ b/templates/mj-equipment-lifecycle-report-template.docx
@@ -27,7 +27,7 @@
           <w:sz w:val="20"/>
           <w:szCs w:val="20"/>
         </w:rPr>
-        <w:t xml:space="preserve">Format No.: SOP/DP/QA/014/F22-R00</w:t>
+        <w:t xml:space="preserve">Format No.: SOP/DP/QA/014/F22-R00 (proposed)</w:t>
       </w:r>
     </w:p>
     <w:tbl>
@@ -1181,18 +1181,6 @@
     </w:p>
     <w:p>
       <w:pPr>
-        <w:spacing w:before="80" w:after="80"/>
-      </w:pPr>
-      <w:r>
-        <w:rPr>
-          <w:sz w:val="20"/>
-          <w:szCs w:val="20"/>
-        </w:rPr>
-        <w:t xml:space="preserve">{@breakdownTableXml}</w:t>
-      </w:r>
-    </w:p>
-    <w:p>
-      <w:pPr>
         <w:spacing w:before="200" w:after="80"/>
       </w:pPr>
       <w:r>
@@ -1219,6 +1207,18 @@
     </w:p>
     <w:p>
       <w:pPr>
+        <w:spacing w:before="80" w:after="80"/>
+      </w:pPr>
+      <w:r>
+        <w:rPr>
+          <w:sz w:val="20"/>
+          <w:szCs w:val="20"/>
+        </w:rPr>
+        <w:t xml:space="preserve">{@breakdownTableXml}</w:t>
+      </w:r>
+    </w:p>
+    <w:p>
+      <w:pPr>
         <w:spacing w:before="200" w:after="80"/>
       </w:pPr>
       <w:r>
@@ -1283,18 +1283,6 @@
     </w:p>
     <w:p>
       <w:pPr>
-        <w:spacing w:before="80" w:after="80"/>
-      </w:pPr>
-      <w:r>
-        <w:rPr>
-          <w:sz w:val="20"/>
-          <w:szCs w:val="20"/>
-        </w:rPr>
-        <w:t xml:space="preserve">{@alarmTableXml}</w:t>
-      </w:r>
-    </w:p>
-    <w:p>
-      <w:pPr>
         <w:spacing w:before="200" w:after="80"/>
       </w:pPr>
       <w:r>
@@ -1317,6 +1305,18 @@
           <w:szCs w:val="20"/>
         </w:rPr>
         <w:t xml:space="preserve">{@alarmTrendXml}</w:t>
+      </w:r>
+    </w:p>
+    <w:p>
+      <w:pPr>
+        <w:spacing w:before="80" w:after="80"/>
+      </w:pPr>
+      <w:r>
+        <w:rPr>
+          <w:sz w:val="20"/>
+          <w:szCs w:val="20"/>
+        </w:rPr>
+        <w:t xml:space="preserve">{@alarmTableXml}</w:t>
       </w:r>
     </w:p>
     <w:p>

</xml_diff>

<commit_message>
Put ELR Alarm Trends above Breakdowns and skip alarm PDFs on that walk.
Remaining-section now drafts Alarm Trends as 3.9, then Breakdowns as 3.10,
so Breakdowns can cite the compiled alarm table instead of walking the
alarm-trend attachment again.

Co-authored-by: sachin.agrawal272 <sachin.agrawal272@gmail.com>
</commit_message>
<xml_diff>
--- a/templates/mj-equipment-lifecycle-report-template.docx
+++ b/templates/mj-equipment-lifecycle-report-template.docx
@@ -1164,7 +1164,7 @@
           <w:sz w:val="22"/>
           <w:szCs w:val="22"/>
         </w:rPr>
-        <w:t xml:space="preserve">3.9 BREAKDOWNS AND TRENDS</w:t>
+        <w:t xml:space="preserve">3.9 ALARM TRENDS</w:t>
       </w:r>
     </w:p>
     <w:p>
@@ -1176,7 +1176,7 @@
           <w:sz w:val="20"/>
           <w:szCs w:val="20"/>
         </w:rPr>
-        <w:t xml:space="preserve">{@breakdownXml}</w:t>
+        <w:t xml:space="preserve">{@alarmXml}</w:t>
       </w:r>
     </w:p>
     <w:p>
@@ -1190,7 +1190,7 @@
           <w:sz w:val="22"/>
           <w:szCs w:val="22"/>
         </w:rPr>
-        <w:t xml:space="preserve">3.9.1 BREAKDOWN TREND SUMMARY</w:t>
+        <w:t xml:space="preserve">3.9.1 ALARM TREND SUMMARY</w:t>
       </w:r>
     </w:p>
     <w:p>
@@ -1202,7 +1202,7 @@
           <w:sz w:val="20"/>
           <w:szCs w:val="20"/>
         </w:rPr>
-        <w:t xml:space="preserve">{@breakdownTrendXml}</w:t>
+        <w:t xml:space="preserve">{@alarmTrendXml}</w:t>
       </w:r>
     </w:p>
     <w:p>
@@ -1214,7 +1214,7 @@
           <w:sz w:val="20"/>
           <w:szCs w:val="20"/>
         </w:rPr>
-        <w:t xml:space="preserve">{@breakdownTableXml}</w:t>
+        <w:t xml:space="preserve">{@alarmTableXml}</w:t>
       </w:r>
     </w:p>
     <w:p>
@@ -1228,7 +1228,7 @@
           <w:sz w:val="22"/>
           <w:szCs w:val="22"/>
         </w:rPr>
-        <w:t xml:space="preserve">3.10 QMS RECORDS SINCE LAST PERIODIC RE-QUALIFICATION</w:t>
+        <w:t xml:space="preserve">3.10 BREAKDOWNS AND TRENDS</w:t>
       </w:r>
     </w:p>
     <w:p>
@@ -1240,19 +1240,7 @@
           <w:sz w:val="20"/>
           <w:szCs w:val="20"/>
         </w:rPr>
-        <w:t xml:space="preserve">{@qmsXml}</w:t>
-      </w:r>
-    </w:p>
-    <w:p>
-      <w:pPr>
-        <w:spacing w:before="80" w:after="80"/>
-      </w:pPr>
-      <w:r>
-        <w:rPr>
-          <w:sz w:val="20"/>
-          <w:szCs w:val="20"/>
-        </w:rPr>
-        <w:t xml:space="preserve">{@qmsTableXml}</w:t>
+        <w:t xml:space="preserve">{@breakdownXml}</w:t>
       </w:r>
     </w:p>
     <w:p>
@@ -1266,7 +1254,7 @@
           <w:sz w:val="22"/>
           <w:szCs w:val="22"/>
         </w:rPr>
-        <w:t xml:space="preserve">3.11 ALARM TRENDS</w:t>
+        <w:t xml:space="preserve">3.10.1 BREAKDOWN TREND SUMMARY</w:t>
       </w:r>
     </w:p>
     <w:p>
@@ -1278,7 +1266,19 @@
           <w:sz w:val="20"/>
           <w:szCs w:val="20"/>
         </w:rPr>
-        <w:t xml:space="preserve">{@alarmXml}</w:t>
+        <w:t xml:space="preserve">{@breakdownTrendXml}</w:t>
+      </w:r>
+    </w:p>
+    <w:p>
+      <w:pPr>
+        <w:spacing w:before="80" w:after="80"/>
+      </w:pPr>
+      <w:r>
+        <w:rPr>
+          <w:sz w:val="20"/>
+          <w:szCs w:val="20"/>
+        </w:rPr>
+        <w:t xml:space="preserve">{@breakdownTableXml}</w:t>
       </w:r>
     </w:p>
     <w:p>
@@ -1292,7 +1292,7 @@
           <w:sz w:val="22"/>
           <w:szCs w:val="22"/>
         </w:rPr>
-        <w:t xml:space="preserve">3.11.1 ALARM TREND SUMMARY</w:t>
+        <w:t xml:space="preserve">3.11 QMS RECORDS SINCE LAST PERIODIC RE-QUALIFICATION</w:t>
       </w:r>
     </w:p>
     <w:p>
@@ -1304,7 +1304,7 @@
           <w:sz w:val="20"/>
           <w:szCs w:val="20"/>
         </w:rPr>
-        <w:t xml:space="preserve">{@alarmTrendXml}</w:t>
+        <w:t xml:space="preserve">{@qmsXml}</w:t>
       </w:r>
     </w:p>
     <w:p>
@@ -1316,7 +1316,7 @@
           <w:sz w:val="20"/>
           <w:szCs w:val="20"/>
         </w:rPr>
-        <w:t xml:space="preserve">{@alarmTableXml}</w:t>
+        <w:t xml:space="preserve">{@qmsTableXml}</w:t>
       </w:r>
     </w:p>
     <w:p>

</xml_diff>

<commit_message>
Stop ELR Breakdowns hang; put Alarm Trends above Breakdowns (#357)
* Stop ELR remaining-section hanging on a truncated breakdowns review.

Queue preferred PRQR/PMC pages even when a few CSV-IQ or FAT headers score, demote CSV-IQ like CSV-OQ, and do not forceStart the same matching walk after a truncated finish that cannot unlock edit_table.

Co-authored-by: sachin.agrawal272 <sachin.agrawal272@gmail.com>

* Put ELR Alarm Trends above Breakdowns and skip alarm PDFs on that walk.

Remaining-section now drafts Alarm Trends as 3.9, then Breakdowns as 3.10,
so Breakdowns can cite the compiled alarm table instead of walking the
alarm-trend attachment again.

Co-authored-by: sachin.agrawal272 <sachin.agrawal272@gmail.com>

---------

Co-authored-by: Cursor Agent <cursoragent@cursor.com>
</commit_message>
<xml_diff>
--- a/templates/mj-equipment-lifecycle-report-template.docx
+++ b/templates/mj-equipment-lifecycle-report-template.docx
@@ -1164,7 +1164,7 @@
           <w:sz w:val="22"/>
           <w:szCs w:val="22"/>
         </w:rPr>
-        <w:t xml:space="preserve">3.9 BREAKDOWNS AND TRENDS</w:t>
+        <w:t xml:space="preserve">3.9 ALARM TRENDS</w:t>
       </w:r>
     </w:p>
     <w:p>
@@ -1176,7 +1176,7 @@
           <w:sz w:val="20"/>
           <w:szCs w:val="20"/>
         </w:rPr>
-        <w:t xml:space="preserve">{@breakdownXml}</w:t>
+        <w:t xml:space="preserve">{@alarmXml}</w:t>
       </w:r>
     </w:p>
     <w:p>
@@ -1190,7 +1190,7 @@
           <w:sz w:val="22"/>
           <w:szCs w:val="22"/>
         </w:rPr>
-        <w:t xml:space="preserve">3.9.1 BREAKDOWN TREND SUMMARY</w:t>
+        <w:t xml:space="preserve">3.9.1 ALARM TREND SUMMARY</w:t>
       </w:r>
     </w:p>
     <w:p>
@@ -1202,7 +1202,7 @@
           <w:sz w:val="20"/>
           <w:szCs w:val="20"/>
         </w:rPr>
-        <w:t xml:space="preserve">{@breakdownTrendXml}</w:t>
+        <w:t xml:space="preserve">{@alarmTrendXml}</w:t>
       </w:r>
     </w:p>
     <w:p>
@@ -1214,7 +1214,7 @@
           <w:sz w:val="20"/>
           <w:szCs w:val="20"/>
         </w:rPr>
-        <w:t xml:space="preserve">{@breakdownTableXml}</w:t>
+        <w:t xml:space="preserve">{@alarmTableXml}</w:t>
       </w:r>
     </w:p>
     <w:p>
@@ -1228,7 +1228,7 @@
           <w:sz w:val="22"/>
           <w:szCs w:val="22"/>
         </w:rPr>
-        <w:t xml:space="preserve">3.10 QMS RECORDS SINCE LAST PERIODIC RE-QUALIFICATION</w:t>
+        <w:t xml:space="preserve">3.10 BREAKDOWNS AND TRENDS</w:t>
       </w:r>
     </w:p>
     <w:p>
@@ -1240,19 +1240,7 @@
           <w:sz w:val="20"/>
           <w:szCs w:val="20"/>
         </w:rPr>
-        <w:t xml:space="preserve">{@qmsXml}</w:t>
-      </w:r>
-    </w:p>
-    <w:p>
-      <w:pPr>
-        <w:spacing w:before="80" w:after="80"/>
-      </w:pPr>
-      <w:r>
-        <w:rPr>
-          <w:sz w:val="20"/>
-          <w:szCs w:val="20"/>
-        </w:rPr>
-        <w:t xml:space="preserve">{@qmsTableXml}</w:t>
+        <w:t xml:space="preserve">{@breakdownXml}</w:t>
       </w:r>
     </w:p>
     <w:p>
@@ -1266,7 +1254,7 @@
           <w:sz w:val="22"/>
           <w:szCs w:val="22"/>
         </w:rPr>
-        <w:t xml:space="preserve">3.11 ALARM TRENDS</w:t>
+        <w:t xml:space="preserve">3.10.1 BREAKDOWN TREND SUMMARY</w:t>
       </w:r>
     </w:p>
     <w:p>
@@ -1278,7 +1266,19 @@
           <w:sz w:val="20"/>
           <w:szCs w:val="20"/>
         </w:rPr>
-        <w:t xml:space="preserve">{@alarmXml}</w:t>
+        <w:t xml:space="preserve">{@breakdownTrendXml}</w:t>
+      </w:r>
+    </w:p>
+    <w:p>
+      <w:pPr>
+        <w:spacing w:before="80" w:after="80"/>
+      </w:pPr>
+      <w:r>
+        <w:rPr>
+          <w:sz w:val="20"/>
+          <w:szCs w:val="20"/>
+        </w:rPr>
+        <w:t xml:space="preserve">{@breakdownTableXml}</w:t>
       </w:r>
     </w:p>
     <w:p>
@@ -1292,7 +1292,7 @@
           <w:sz w:val="22"/>
           <w:szCs w:val="22"/>
         </w:rPr>
-        <w:t xml:space="preserve">3.11.1 ALARM TREND SUMMARY</w:t>
+        <w:t xml:space="preserve">3.11 QMS RECORDS SINCE LAST PERIODIC RE-QUALIFICATION</w:t>
       </w:r>
     </w:p>
     <w:p>
@@ -1304,7 +1304,7 @@
           <w:sz w:val="20"/>
           <w:szCs w:val="20"/>
         </w:rPr>
-        <w:t xml:space="preserve">{@alarmTrendXml}</w:t>
+        <w:t xml:space="preserve">{@qmsXml}</w:t>
       </w:r>
     </w:p>
     <w:p>
@@ -1316,7 +1316,7 @@
           <w:sz w:val="20"/>
           <w:szCs w:val="20"/>
         </w:rPr>
-        <w:t xml:space="preserve">{@alarmTableXml}</w:t>
+        <w:t xml:space="preserve">{@qmsTableXml}</w:t>
       </w:r>
     </w:p>
     <w:p>

</xml_diff>

<commit_message>
Move ELR Alarm Trends above Monitoring.
Put 3.6 Alarm Trends ahead of Monitoring so remaining-section can cite that table instead of walking the alarm-trend PDF twice. Monitoring and Breakdowns skip that file; Word F10 numbering, TOC, and draftOrder follow.

Co-authored-by: sachin.agrawal272 <sachin.agrawal272@gmail.com>
</commit_message>
<xml_diff>
--- a/templates/mj-equipment-lifecycle-report-template.docx
+++ b/templates/mj-equipment-lifecycle-report-template.docx
@@ -1050,7 +1050,7 @@
           <w:sz w:val="22"/>
           <w:szCs w:val="22"/>
         </w:rPr>
-        <w:t xml:space="preserve">3.6 MONITORING</w:t>
+        <w:t xml:space="preserve">3.6 ALARM TRENDS</w:t>
       </w:r>
     </w:p>
     <w:p>
@@ -1062,19 +1062,7 @@
           <w:sz w:val="20"/>
           <w:szCs w:val="20"/>
         </w:rPr>
-        <w:t xml:space="preserve">{@monitoringXml}</w:t>
-      </w:r>
-    </w:p>
-    <w:p>
-      <w:pPr>
-        <w:spacing w:before="80" w:after="80"/>
-      </w:pPr>
-      <w:r>
-        <w:rPr>
-          <w:sz w:val="20"/>
-          <w:szCs w:val="20"/>
-        </w:rPr>
-        <w:t xml:space="preserve">{@monitoringTableXml}</w:t>
+        <w:t xml:space="preserve">{@alarmXml}</w:t>
       </w:r>
     </w:p>
     <w:p>
@@ -1088,7 +1076,7 @@
           <w:sz w:val="22"/>
           <w:szCs w:val="22"/>
         </w:rPr>
-        <w:t xml:space="preserve">3.7 CALIBRATION OF ASSOCIATED INSTRUMENTS</w:t>
+        <w:t xml:space="preserve">3.6.1 ALARM TREND SUMMARY</w:t>
       </w:r>
     </w:p>
     <w:p>
@@ -1100,7 +1088,7 @@
           <w:sz w:val="20"/>
           <w:szCs w:val="20"/>
         </w:rPr>
-        <w:t xml:space="preserve">{@calibrationXml}</w:t>
+        <w:t xml:space="preserve">{@alarmTrendXml}</w:t>
       </w:r>
     </w:p>
     <w:p>
@@ -1112,7 +1100,7 @@
           <w:sz w:val="20"/>
           <w:szCs w:val="20"/>
         </w:rPr>
-        <w:t xml:space="preserve">{@calibrationTableXml}</w:t>
+        <w:t xml:space="preserve">{@alarmTableXml}</w:t>
       </w:r>
     </w:p>
     <w:p>
@@ -1126,7 +1114,7 @@
           <w:sz w:val="22"/>
           <w:szCs w:val="22"/>
         </w:rPr>
-        <w:t xml:space="preserve">3.8 PREVENTIVE MAINTENANCE</w:t>
+        <w:t xml:space="preserve">3.7 MONITORING</w:t>
       </w:r>
     </w:p>
     <w:p>
@@ -1138,7 +1126,7 @@
           <w:sz w:val="20"/>
           <w:szCs w:val="20"/>
         </w:rPr>
-        <w:t xml:space="preserve">{@preventiveMaintenanceXml}</w:t>
+        <w:t xml:space="preserve">{@monitoringXml}</w:t>
       </w:r>
     </w:p>
     <w:p>
@@ -1150,7 +1138,7 @@
           <w:sz w:val="20"/>
           <w:szCs w:val="20"/>
         </w:rPr>
-        <w:t xml:space="preserve">{@preventiveMaintenanceTableXml}</w:t>
+        <w:t xml:space="preserve">{@monitoringTableXml}</w:t>
       </w:r>
     </w:p>
     <w:p>
@@ -1164,7 +1152,7 @@
           <w:sz w:val="22"/>
           <w:szCs w:val="22"/>
         </w:rPr>
-        <w:t xml:space="preserve">3.9 ALARM TRENDS</w:t>
+        <w:t xml:space="preserve">3.8 CALIBRATION OF ASSOCIATED INSTRUMENTS</w:t>
       </w:r>
     </w:p>
     <w:p>
@@ -1176,7 +1164,19 @@
           <w:sz w:val="20"/>
           <w:szCs w:val="20"/>
         </w:rPr>
-        <w:t xml:space="preserve">{@alarmXml}</w:t>
+        <w:t xml:space="preserve">{@calibrationXml}</w:t>
+      </w:r>
+    </w:p>
+    <w:p>
+      <w:pPr>
+        <w:spacing w:before="80" w:after="80"/>
+      </w:pPr>
+      <w:r>
+        <w:rPr>
+          <w:sz w:val="20"/>
+          <w:szCs w:val="20"/>
+        </w:rPr>
+        <w:t xml:space="preserve">{@calibrationTableXml}</w:t>
       </w:r>
     </w:p>
     <w:p>
@@ -1190,7 +1190,7 @@
           <w:sz w:val="22"/>
           <w:szCs w:val="22"/>
         </w:rPr>
-        <w:t xml:space="preserve">3.9.1 ALARM TREND SUMMARY</w:t>
+        <w:t xml:space="preserve">3.9 PREVENTIVE MAINTENANCE</w:t>
       </w:r>
     </w:p>
     <w:p>
@@ -1202,7 +1202,7 @@
           <w:sz w:val="20"/>
           <w:szCs w:val="20"/>
         </w:rPr>
-        <w:t xml:space="preserve">{@alarmTrendXml}</w:t>
+        <w:t xml:space="preserve">{@preventiveMaintenanceXml}</w:t>
       </w:r>
     </w:p>
     <w:p>
@@ -1214,7 +1214,7 @@
           <w:sz w:val="20"/>
           <w:szCs w:val="20"/>
         </w:rPr>
-        <w:t xml:space="preserve">{@alarmTableXml}</w:t>
+        <w:t xml:space="preserve">{@preventiveMaintenanceTableXml}</w:t>
       </w:r>
     </w:p>
     <w:p>

</xml_diff>

<commit_message>
Restore ELR station lists and move Alarm Trends above Monitoring (#372)
* List ELR equipment stations instead of packing them into a paragraph.

Agent drafts of Equipment and System Description had collapsed stations
into one packed paragraph after verbosity told the model to do that.
Restore the numbered/bulleted station recipe, fail packed prose on
eval, and ignore a trailing Citations list.

Co-authored-by: sachin.agrawal272 <sachin.agrawal272@gmail.com>

* Move ELR Alarm Trends above Monitoring.

Put 3.6 Alarm Trends ahead of Monitoring so remaining-section can cite that table instead of walking the alarm-trend PDF twice. Monitoring and Breakdowns skip that file; Word F10 numbering, TOC, and draftOrder follow.

Co-authored-by: sachin.agrawal272 <sachin.agrawal272@gmail.com>

---------

Co-authored-by: Cursor Agent <cursoragent@cursor.com>
</commit_message>
<xml_diff>
--- a/templates/mj-equipment-lifecycle-report-template.docx
+++ b/templates/mj-equipment-lifecycle-report-template.docx
@@ -1050,7 +1050,7 @@
           <w:sz w:val="22"/>
           <w:szCs w:val="22"/>
         </w:rPr>
-        <w:t xml:space="preserve">3.6 MONITORING</w:t>
+        <w:t xml:space="preserve">3.6 ALARM TRENDS</w:t>
       </w:r>
     </w:p>
     <w:p>
@@ -1062,19 +1062,7 @@
           <w:sz w:val="20"/>
           <w:szCs w:val="20"/>
         </w:rPr>
-        <w:t xml:space="preserve">{@monitoringXml}</w:t>
-      </w:r>
-    </w:p>
-    <w:p>
-      <w:pPr>
-        <w:spacing w:before="80" w:after="80"/>
-      </w:pPr>
-      <w:r>
-        <w:rPr>
-          <w:sz w:val="20"/>
-          <w:szCs w:val="20"/>
-        </w:rPr>
-        <w:t xml:space="preserve">{@monitoringTableXml}</w:t>
+        <w:t xml:space="preserve">{@alarmXml}</w:t>
       </w:r>
     </w:p>
     <w:p>
@@ -1088,7 +1076,7 @@
           <w:sz w:val="22"/>
           <w:szCs w:val="22"/>
         </w:rPr>
-        <w:t xml:space="preserve">3.7 CALIBRATION OF ASSOCIATED INSTRUMENTS</w:t>
+        <w:t xml:space="preserve">3.6.1 ALARM TREND SUMMARY</w:t>
       </w:r>
     </w:p>
     <w:p>
@@ -1100,7 +1088,7 @@
           <w:sz w:val="20"/>
           <w:szCs w:val="20"/>
         </w:rPr>
-        <w:t xml:space="preserve">{@calibrationXml}</w:t>
+        <w:t xml:space="preserve">{@alarmTrendXml}</w:t>
       </w:r>
     </w:p>
     <w:p>
@@ -1112,7 +1100,7 @@
           <w:sz w:val="20"/>
           <w:szCs w:val="20"/>
         </w:rPr>
-        <w:t xml:space="preserve">{@calibrationTableXml}</w:t>
+        <w:t xml:space="preserve">{@alarmTableXml}</w:t>
       </w:r>
     </w:p>
     <w:p>
@@ -1126,7 +1114,7 @@
           <w:sz w:val="22"/>
           <w:szCs w:val="22"/>
         </w:rPr>
-        <w:t xml:space="preserve">3.8 PREVENTIVE MAINTENANCE</w:t>
+        <w:t xml:space="preserve">3.7 MONITORING</w:t>
       </w:r>
     </w:p>
     <w:p>
@@ -1138,7 +1126,7 @@
           <w:sz w:val="20"/>
           <w:szCs w:val="20"/>
         </w:rPr>
-        <w:t xml:space="preserve">{@preventiveMaintenanceXml}</w:t>
+        <w:t xml:space="preserve">{@monitoringXml}</w:t>
       </w:r>
     </w:p>
     <w:p>
@@ -1150,7 +1138,7 @@
           <w:sz w:val="20"/>
           <w:szCs w:val="20"/>
         </w:rPr>
-        <w:t xml:space="preserve">{@preventiveMaintenanceTableXml}</w:t>
+        <w:t xml:space="preserve">{@monitoringTableXml}</w:t>
       </w:r>
     </w:p>
     <w:p>
@@ -1164,7 +1152,7 @@
           <w:sz w:val="22"/>
           <w:szCs w:val="22"/>
         </w:rPr>
-        <w:t xml:space="preserve">3.9 ALARM TRENDS</w:t>
+        <w:t xml:space="preserve">3.8 CALIBRATION OF ASSOCIATED INSTRUMENTS</w:t>
       </w:r>
     </w:p>
     <w:p>
@@ -1176,7 +1164,19 @@
           <w:sz w:val="20"/>
           <w:szCs w:val="20"/>
         </w:rPr>
-        <w:t xml:space="preserve">{@alarmXml}</w:t>
+        <w:t xml:space="preserve">{@calibrationXml}</w:t>
+      </w:r>
+    </w:p>
+    <w:p>
+      <w:pPr>
+        <w:spacing w:before="80" w:after="80"/>
+      </w:pPr>
+      <w:r>
+        <w:rPr>
+          <w:sz w:val="20"/>
+          <w:szCs w:val="20"/>
+        </w:rPr>
+        <w:t xml:space="preserve">{@calibrationTableXml}</w:t>
       </w:r>
     </w:p>
     <w:p>
@@ -1190,7 +1190,7 @@
           <w:sz w:val="22"/>
           <w:szCs w:val="22"/>
         </w:rPr>
-        <w:t xml:space="preserve">3.9.1 ALARM TREND SUMMARY</w:t>
+        <w:t xml:space="preserve">3.9 PREVENTIVE MAINTENANCE</w:t>
       </w:r>
     </w:p>
     <w:p>
@@ -1202,7 +1202,7 @@
           <w:sz w:val="20"/>
           <w:szCs w:val="20"/>
         </w:rPr>
-        <w:t xml:space="preserve">{@alarmTrendXml}</w:t>
+        <w:t xml:space="preserve">{@preventiveMaintenanceXml}</w:t>
       </w:r>
     </w:p>
     <w:p>
@@ -1214,7 +1214,7 @@
           <w:sz w:val="20"/>
           <w:szCs w:val="20"/>
         </w:rPr>
-        <w:t xml:space="preserve">{@alarmTableXml}</w:t>
+        <w:t xml:space="preserve">{@preventiveMaintenanceTableXml}</w:t>
       </w:r>
     </w:p>
     <w:p>

</xml_diff>

<commit_message>
Add ELR process, cleaning, and QRA review sections after qualification.
Place Process Validation Review (3.5), Cleaning Validation Review (3.6),
and Quality Risk Assessment Review (3.7) after Qualification. Keep 5.2 as
the period action list. Shift later Observations numbering through 3.17,
wire inventory chat, Word export, and recap rows, and bump the ELR prompt
version so cached evals invalidate.

Co-authored-by: sachin.agrawal272 <sachin.agrawal272@gmail.com>
</commit_message>
<xml_diff>
--- a/templates/mj-equipment-lifecycle-report-template.docx
+++ b/templates/mj-equipment-lifecycle-report-template.docx
@@ -1003,6 +1003,7 @@
     </w:p>
     <w:p>
       <w:pPr>
+        <w:spacing w:before="80" w:after="80"/>
         <w:spacing w:before="200" w:after="80"/>
       </w:pPr>
       <w:r>
@@ -1012,7 +1013,7 @@
           <w:sz w:val="22"/>
           <w:szCs w:val="22"/>
         </w:rPr>
-        <w:t xml:space="preserve">3.5 MEDIA FILL / ASEPTIC PROCESS SIMULATION</w:t>
+        <w:t xml:space="preserve">3.5 PROCESS VALIDATION REVIEW</w:t>
       </w:r>
     </w:p>
     <w:p>
@@ -1024,7 +1025,7 @@
           <w:sz w:val="20"/>
           <w:szCs w:val="20"/>
         </w:rPr>
-        <w:t xml:space="preserve">{@mediaFillXml}</w:t>
+        <w:t xml:space="preserve">{@processValidationXml}</w:t>
       </w:r>
     </w:p>
     <w:p>
@@ -1036,11 +1037,12 @@
           <w:sz w:val="20"/>
           <w:szCs w:val="20"/>
         </w:rPr>
-        <w:t xml:space="preserve">{@mediaFillTableXml}</w:t>
-      </w:r>
-    </w:p>
-    <w:p>
-      <w:pPr>
+        <w:t xml:space="preserve">{@processValidationTableXml}</w:t>
+      </w:r>
+    </w:p>
+    <w:p>
+      <w:pPr>
+        <w:spacing w:before="80" w:after="80"/>
         <w:spacing w:before="200" w:after="80"/>
       </w:pPr>
       <w:r>
@@ -1050,7 +1052,7 @@
           <w:sz w:val="22"/>
           <w:szCs w:val="22"/>
         </w:rPr>
-        <w:t xml:space="preserve">3.6 ALARM TRENDS</w:t>
+        <w:t xml:space="preserve">3.6 CLEANING VALIDATION REVIEW</w:t>
       </w:r>
     </w:p>
     <w:p>
@@ -1062,11 +1064,24 @@
           <w:sz w:val="20"/>
           <w:szCs w:val="20"/>
         </w:rPr>
-        <w:t xml:space="preserve">{@alarmXml}</w:t>
-      </w:r>
-    </w:p>
-    <w:p>
-      <w:pPr>
+        <w:t xml:space="preserve">{@cleaningValidationXml}</w:t>
+      </w:r>
+    </w:p>
+    <w:p>
+      <w:pPr>
+        <w:spacing w:before="80" w:after="80"/>
+      </w:pPr>
+      <w:r>
+        <w:rPr>
+          <w:sz w:val="20"/>
+          <w:szCs w:val="20"/>
+        </w:rPr>
+        <w:t xml:space="preserve">{@cleaningValidationTableXml}</w:t>
+      </w:r>
+    </w:p>
+    <w:p>
+      <w:pPr>
+        <w:spacing w:before="80" w:after="80"/>
         <w:spacing w:before="200" w:after="80"/>
       </w:pPr>
       <w:r>
@@ -1076,7 +1091,7 @@
           <w:sz w:val="22"/>
           <w:szCs w:val="22"/>
         </w:rPr>
-        <w:t xml:space="preserve">3.6.1 ALARM TREND SUMMARY</w:t>
+        <w:t xml:space="preserve">3.7 QUALITY RISK ASSESSMENT REVIEW</w:t>
       </w:r>
     </w:p>
     <w:p>
@@ -1088,7 +1103,7 @@
           <w:sz w:val="20"/>
           <w:szCs w:val="20"/>
         </w:rPr>
-        <w:t xml:space="preserve">{@alarmTrendXml}</w:t>
+        <w:t xml:space="preserve">{@qraReviewXml}</w:t>
       </w:r>
     </w:p>
     <w:p>
@@ -1100,7 +1115,7 @@
           <w:sz w:val="20"/>
           <w:szCs w:val="20"/>
         </w:rPr>
-        <w:t xml:space="preserve">{@alarmTableXml}</w:t>
+        <w:t xml:space="preserve">{@qraReviewTableXml}</w:t>
       </w:r>
     </w:p>
     <w:p>
@@ -1114,7 +1129,7 @@
           <w:sz w:val="22"/>
           <w:szCs w:val="22"/>
         </w:rPr>
-        <w:t xml:space="preserve">3.7 MONITORING</w:t>
+        <w:t xml:space="preserve">3.8 MEDIA FILL / ASEPTIC PROCESS SIMULATION</w:t>
       </w:r>
     </w:p>
     <w:p>
@@ -1126,7 +1141,7 @@
           <w:sz w:val="20"/>
           <w:szCs w:val="20"/>
         </w:rPr>
-        <w:t xml:space="preserve">{@monitoringXml}</w:t>
+        <w:t xml:space="preserve">{@mediaFillXml}</w:t>
       </w:r>
     </w:p>
     <w:p>
@@ -1138,7 +1153,7 @@
           <w:sz w:val="20"/>
           <w:szCs w:val="20"/>
         </w:rPr>
-        <w:t xml:space="preserve">{@monitoringTableXml}</w:t>
+        <w:t xml:space="preserve">{@mediaFillTableXml}</w:t>
       </w:r>
     </w:p>
     <w:p>
@@ -1152,7 +1167,7 @@
           <w:sz w:val="22"/>
           <w:szCs w:val="22"/>
         </w:rPr>
-        <w:t xml:space="preserve">3.8 CALIBRATION OF ASSOCIATED INSTRUMENTS</w:t>
+        <w:t xml:space="preserve">3.9 ALARM TRENDS</w:t>
       </w:r>
     </w:p>
     <w:p>
@@ -1164,19 +1179,7 @@
           <w:sz w:val="20"/>
           <w:szCs w:val="20"/>
         </w:rPr>
-        <w:t xml:space="preserve">{@calibrationXml}</w:t>
-      </w:r>
-    </w:p>
-    <w:p>
-      <w:pPr>
-        <w:spacing w:before="80" w:after="80"/>
-      </w:pPr>
-      <w:r>
-        <w:rPr>
-          <w:sz w:val="20"/>
-          <w:szCs w:val="20"/>
-        </w:rPr>
-        <w:t xml:space="preserve">{@calibrationTableXml}</w:t>
+        <w:t xml:space="preserve">{@alarmXml}</w:t>
       </w:r>
     </w:p>
     <w:p>
@@ -1190,7 +1193,7 @@
           <w:sz w:val="22"/>
           <w:szCs w:val="22"/>
         </w:rPr>
-        <w:t xml:space="preserve">3.9 PREVENTIVE MAINTENANCE</w:t>
+        <w:t xml:space="preserve">3.9.1 ALARM TREND SUMMARY</w:t>
       </w:r>
     </w:p>
     <w:p>
@@ -1202,7 +1205,7 @@
           <w:sz w:val="20"/>
           <w:szCs w:val="20"/>
         </w:rPr>
-        <w:t xml:space="preserve">{@preventiveMaintenanceXml}</w:t>
+        <w:t xml:space="preserve">{@alarmTrendXml}</w:t>
       </w:r>
     </w:p>
     <w:p>
@@ -1214,7 +1217,7 @@
           <w:sz w:val="20"/>
           <w:szCs w:val="20"/>
         </w:rPr>
-        <w:t xml:space="preserve">{@preventiveMaintenanceTableXml}</w:t>
+        <w:t xml:space="preserve">{@alarmTableXml}</w:t>
       </w:r>
     </w:p>
     <w:p>
@@ -1228,7 +1231,7 @@
           <w:sz w:val="22"/>
           <w:szCs w:val="22"/>
         </w:rPr>
-        <w:t xml:space="preserve">3.10 BREAKDOWNS AND TRENDS</w:t>
+        <w:t xml:space="preserve">3.10 MONITORING</w:t>
       </w:r>
     </w:p>
     <w:p>
@@ -1240,7 +1243,19 @@
           <w:sz w:val="20"/>
           <w:szCs w:val="20"/>
         </w:rPr>
-        <w:t xml:space="preserve">{@breakdownXml}</w:t>
+        <w:t xml:space="preserve">{@monitoringXml}</w:t>
+      </w:r>
+    </w:p>
+    <w:p>
+      <w:pPr>
+        <w:spacing w:before="80" w:after="80"/>
+      </w:pPr>
+      <w:r>
+        <w:rPr>
+          <w:sz w:val="20"/>
+          <w:szCs w:val="20"/>
+        </w:rPr>
+        <w:t xml:space="preserve">{@monitoringTableXml}</w:t>
       </w:r>
     </w:p>
     <w:p>
@@ -1254,7 +1269,7 @@
           <w:sz w:val="22"/>
           <w:szCs w:val="22"/>
         </w:rPr>
-        <w:t xml:space="preserve">3.10.1 BREAKDOWN TREND SUMMARY</w:t>
+        <w:t xml:space="preserve">3.11 CALIBRATION OF ASSOCIATED INSTRUMENTS</w:t>
       </w:r>
     </w:p>
     <w:p>
@@ -1266,7 +1281,7 @@
           <w:sz w:val="20"/>
           <w:szCs w:val="20"/>
         </w:rPr>
-        <w:t xml:space="preserve">{@breakdownTrendXml}</w:t>
+        <w:t xml:space="preserve">{@calibrationXml}</w:t>
       </w:r>
     </w:p>
     <w:p>
@@ -1278,7 +1293,7 @@
           <w:sz w:val="20"/>
           <w:szCs w:val="20"/>
         </w:rPr>
-        <w:t xml:space="preserve">{@breakdownTableXml}</w:t>
+        <w:t xml:space="preserve">{@calibrationTableXml}</w:t>
       </w:r>
     </w:p>
     <w:p>
@@ -1292,7 +1307,7 @@
           <w:sz w:val="22"/>
           <w:szCs w:val="22"/>
         </w:rPr>
-        <w:t xml:space="preserve">3.11 QMS RECORDS SINCE LAST PERIODIC RE-QUALIFICATION</w:t>
+        <w:t xml:space="preserve">3.12 PREVENTIVE MAINTENANCE</w:t>
       </w:r>
     </w:p>
     <w:p>
@@ -1304,7 +1319,7 @@
           <w:sz w:val="20"/>
           <w:szCs w:val="20"/>
         </w:rPr>
-        <w:t xml:space="preserve">{@qmsXml}</w:t>
+        <w:t xml:space="preserve">{@preventiveMaintenanceXml}</w:t>
       </w:r>
     </w:p>
     <w:p>
@@ -1316,7 +1331,7 @@
           <w:sz w:val="20"/>
           <w:szCs w:val="20"/>
         </w:rPr>
-        <w:t xml:space="preserve">{@qmsTableXml}</w:t>
+        <w:t xml:space="preserve">{@preventiveMaintenanceTableXml}</w:t>
       </w:r>
     </w:p>
     <w:p>
@@ -1330,7 +1345,7 @@
           <w:sz w:val="22"/>
           <w:szCs w:val="22"/>
         </w:rPr>
-        <w:t xml:space="preserve">3.12 ACCESS CONTROL</w:t>
+        <w:t xml:space="preserve">3.13 BREAKDOWNS AND TRENDS</w:t>
       </w:r>
     </w:p>
     <w:p>
@@ -1342,19 +1357,7 @@
           <w:sz w:val="20"/>
           <w:szCs w:val="20"/>
         </w:rPr>
-        <w:t xml:space="preserve">{@accessControlXml}</w:t>
-      </w:r>
-    </w:p>
-    <w:p>
-      <w:pPr>
-        <w:spacing w:before="80" w:after="80"/>
-      </w:pPr>
-      <w:r>
-        <w:rPr>
-          <w:sz w:val="20"/>
-          <w:szCs w:val="20"/>
-        </w:rPr>
-        <w:t xml:space="preserve">{@accessControlTableXml}</w:t>
+        <w:t xml:space="preserve">{@breakdownXml}</w:t>
       </w:r>
     </w:p>
     <w:p>
@@ -1368,7 +1371,7 @@
           <w:sz w:val="22"/>
           <w:szCs w:val="22"/>
         </w:rPr>
-        <w:t xml:space="preserve">3.13 AUDIT TRAIL REVIEW</w:t>
+        <w:t xml:space="preserve">3.13.1 BREAKDOWN TREND SUMMARY</w:t>
       </w:r>
     </w:p>
     <w:p>
@@ -1380,7 +1383,7 @@
           <w:sz w:val="20"/>
           <w:szCs w:val="20"/>
         </w:rPr>
-        <w:t xml:space="preserve">{@auditTrailXml}</w:t>
+        <w:t xml:space="preserve">{@breakdownTrendXml}</w:t>
       </w:r>
     </w:p>
     <w:p>
@@ -1392,7 +1395,7 @@
           <w:sz w:val="20"/>
           <w:szCs w:val="20"/>
         </w:rPr>
-        <w:t xml:space="preserve">{@auditTrailTableXml}</w:t>
+        <w:t xml:space="preserve">{@breakdownTableXml}</w:t>
       </w:r>
     </w:p>
     <w:p>
@@ -1406,7 +1409,121 @@
           <w:sz w:val="22"/>
           <w:szCs w:val="22"/>
         </w:rPr>
-        <w:t xml:space="preserve">3.14 COMPUTERIZED SYSTEM VALIDATION STATUS</w:t>
+        <w:t xml:space="preserve">3.14 QMS RECORDS SINCE LAST PERIODIC RE-QUALIFICATION</w:t>
+      </w:r>
+    </w:p>
+    <w:p>
+      <w:pPr>
+        <w:spacing w:before="80" w:after="80"/>
+      </w:pPr>
+      <w:r>
+        <w:rPr>
+          <w:sz w:val="20"/>
+          <w:szCs w:val="20"/>
+        </w:rPr>
+        <w:t xml:space="preserve">{@qmsXml}</w:t>
+      </w:r>
+    </w:p>
+    <w:p>
+      <w:pPr>
+        <w:spacing w:before="80" w:after="80"/>
+      </w:pPr>
+      <w:r>
+        <w:rPr>
+          <w:sz w:val="20"/>
+          <w:szCs w:val="20"/>
+        </w:rPr>
+        <w:t xml:space="preserve">{@qmsTableXml}</w:t>
+      </w:r>
+    </w:p>
+    <w:p>
+      <w:pPr>
+        <w:spacing w:before="200" w:after="80"/>
+      </w:pPr>
+      <w:r>
+        <w:rPr>
+          <w:b/>
+          <w:bCs/>
+          <w:sz w:val="22"/>
+          <w:szCs w:val="22"/>
+        </w:rPr>
+        <w:t xml:space="preserve">3.15 ACCESS CONTROL</w:t>
+      </w:r>
+    </w:p>
+    <w:p>
+      <w:pPr>
+        <w:spacing w:before="80" w:after="80"/>
+      </w:pPr>
+      <w:r>
+        <w:rPr>
+          <w:sz w:val="20"/>
+          <w:szCs w:val="20"/>
+        </w:rPr>
+        <w:t xml:space="preserve">{@accessControlXml}</w:t>
+      </w:r>
+    </w:p>
+    <w:p>
+      <w:pPr>
+        <w:spacing w:before="80" w:after="80"/>
+      </w:pPr>
+      <w:r>
+        <w:rPr>
+          <w:sz w:val="20"/>
+          <w:szCs w:val="20"/>
+        </w:rPr>
+        <w:t xml:space="preserve">{@accessControlTableXml}</w:t>
+      </w:r>
+    </w:p>
+    <w:p>
+      <w:pPr>
+        <w:spacing w:before="200" w:after="80"/>
+      </w:pPr>
+      <w:r>
+        <w:rPr>
+          <w:b/>
+          <w:bCs/>
+          <w:sz w:val="22"/>
+          <w:szCs w:val="22"/>
+        </w:rPr>
+        <w:t xml:space="preserve">3.16 AUDIT TRAIL REVIEW</w:t>
+      </w:r>
+    </w:p>
+    <w:p>
+      <w:pPr>
+        <w:spacing w:before="80" w:after="80"/>
+      </w:pPr>
+      <w:r>
+        <w:rPr>
+          <w:sz w:val="20"/>
+          <w:szCs w:val="20"/>
+        </w:rPr>
+        <w:t xml:space="preserve">{@auditTrailXml}</w:t>
+      </w:r>
+    </w:p>
+    <w:p>
+      <w:pPr>
+        <w:spacing w:before="80" w:after="80"/>
+      </w:pPr>
+      <w:r>
+        <w:rPr>
+          <w:sz w:val="20"/>
+          <w:szCs w:val="20"/>
+        </w:rPr>
+        <w:t xml:space="preserve">{@auditTrailTableXml}</w:t>
+      </w:r>
+    </w:p>
+    <w:p>
+      <w:pPr>
+        <w:spacing w:before="200" w:after="80"/>
+      </w:pPr>
+      <w:r>
+        <w:rPr>
+          <w:b/>
+          <w:bCs/>
+          <w:sz w:val="22"/>
+          <w:szCs w:val="22"/>
+        </w:rPr>
+        <w:t xml:space="preserve">3.17 COMPUTERIZED SYSTEM VALIDATION STATUS</w:t>
       </w:r>
     </w:p>
     <w:p>

</xml_diff>

<commit_message>
Add ELR process, cleaning, and QRA review sections after qualification. (#424)
Place Process Validation Review (3.5), Cleaning Validation Review (3.6),
and Quality Risk Assessment Review (3.7) after Qualification. Keep 5.2 as
the period action list. Shift later Observations numbering through 3.17,
wire inventory chat, Word export, and recap rows, and bump the ELR prompt
version so cached evals invalidate.

Co-authored-by: Cursor Agent <cursoragent@cursor.com>
</commit_message>
<xml_diff>
--- a/templates/mj-equipment-lifecycle-report-template.docx
+++ b/templates/mj-equipment-lifecycle-report-template.docx
@@ -1003,6 +1003,7 @@
     </w:p>
     <w:p>
       <w:pPr>
+        <w:spacing w:before="80" w:after="80"/>
         <w:spacing w:before="200" w:after="80"/>
       </w:pPr>
       <w:r>
@@ -1012,7 +1013,7 @@
           <w:sz w:val="22"/>
           <w:szCs w:val="22"/>
         </w:rPr>
-        <w:t xml:space="preserve">3.5 MEDIA FILL / ASEPTIC PROCESS SIMULATION</w:t>
+        <w:t xml:space="preserve">3.5 PROCESS VALIDATION REVIEW</w:t>
       </w:r>
     </w:p>
     <w:p>
@@ -1024,7 +1025,7 @@
           <w:sz w:val="20"/>
           <w:szCs w:val="20"/>
         </w:rPr>
-        <w:t xml:space="preserve">{@mediaFillXml}</w:t>
+        <w:t xml:space="preserve">{@processValidationXml}</w:t>
       </w:r>
     </w:p>
     <w:p>
@@ -1036,11 +1037,12 @@
           <w:sz w:val="20"/>
           <w:szCs w:val="20"/>
         </w:rPr>
-        <w:t xml:space="preserve">{@mediaFillTableXml}</w:t>
-      </w:r>
-    </w:p>
-    <w:p>
-      <w:pPr>
+        <w:t xml:space="preserve">{@processValidationTableXml}</w:t>
+      </w:r>
+    </w:p>
+    <w:p>
+      <w:pPr>
+        <w:spacing w:before="80" w:after="80"/>
         <w:spacing w:before="200" w:after="80"/>
       </w:pPr>
       <w:r>
@@ -1050,7 +1052,7 @@
           <w:sz w:val="22"/>
           <w:szCs w:val="22"/>
         </w:rPr>
-        <w:t xml:space="preserve">3.6 ALARM TRENDS</w:t>
+        <w:t xml:space="preserve">3.6 CLEANING VALIDATION REVIEW</w:t>
       </w:r>
     </w:p>
     <w:p>
@@ -1062,11 +1064,24 @@
           <w:sz w:val="20"/>
           <w:szCs w:val="20"/>
         </w:rPr>
-        <w:t xml:space="preserve">{@alarmXml}</w:t>
-      </w:r>
-    </w:p>
-    <w:p>
-      <w:pPr>
+        <w:t xml:space="preserve">{@cleaningValidationXml}</w:t>
+      </w:r>
+    </w:p>
+    <w:p>
+      <w:pPr>
+        <w:spacing w:before="80" w:after="80"/>
+      </w:pPr>
+      <w:r>
+        <w:rPr>
+          <w:sz w:val="20"/>
+          <w:szCs w:val="20"/>
+        </w:rPr>
+        <w:t xml:space="preserve">{@cleaningValidationTableXml}</w:t>
+      </w:r>
+    </w:p>
+    <w:p>
+      <w:pPr>
+        <w:spacing w:before="80" w:after="80"/>
         <w:spacing w:before="200" w:after="80"/>
       </w:pPr>
       <w:r>
@@ -1076,7 +1091,7 @@
           <w:sz w:val="22"/>
           <w:szCs w:val="22"/>
         </w:rPr>
-        <w:t xml:space="preserve">3.6.1 ALARM TREND SUMMARY</w:t>
+        <w:t xml:space="preserve">3.7 QUALITY RISK ASSESSMENT REVIEW</w:t>
       </w:r>
     </w:p>
     <w:p>
@@ -1088,7 +1103,7 @@
           <w:sz w:val="20"/>
           <w:szCs w:val="20"/>
         </w:rPr>
-        <w:t xml:space="preserve">{@alarmTrendXml}</w:t>
+        <w:t xml:space="preserve">{@qraReviewXml}</w:t>
       </w:r>
     </w:p>
     <w:p>
@@ -1100,7 +1115,7 @@
           <w:sz w:val="20"/>
           <w:szCs w:val="20"/>
         </w:rPr>
-        <w:t xml:space="preserve">{@alarmTableXml}</w:t>
+        <w:t xml:space="preserve">{@qraReviewTableXml}</w:t>
       </w:r>
     </w:p>
     <w:p>
@@ -1114,7 +1129,7 @@
           <w:sz w:val="22"/>
           <w:szCs w:val="22"/>
         </w:rPr>
-        <w:t xml:space="preserve">3.7 MONITORING</w:t>
+        <w:t xml:space="preserve">3.8 MEDIA FILL / ASEPTIC PROCESS SIMULATION</w:t>
       </w:r>
     </w:p>
     <w:p>
@@ -1126,7 +1141,7 @@
           <w:sz w:val="20"/>
           <w:szCs w:val="20"/>
         </w:rPr>
-        <w:t xml:space="preserve">{@monitoringXml}</w:t>
+        <w:t xml:space="preserve">{@mediaFillXml}</w:t>
       </w:r>
     </w:p>
     <w:p>
@@ -1138,7 +1153,7 @@
           <w:sz w:val="20"/>
           <w:szCs w:val="20"/>
         </w:rPr>
-        <w:t xml:space="preserve">{@monitoringTableXml}</w:t>
+        <w:t xml:space="preserve">{@mediaFillTableXml}</w:t>
       </w:r>
     </w:p>
     <w:p>
@@ -1152,7 +1167,7 @@
           <w:sz w:val="22"/>
           <w:szCs w:val="22"/>
         </w:rPr>
-        <w:t xml:space="preserve">3.8 CALIBRATION OF ASSOCIATED INSTRUMENTS</w:t>
+        <w:t xml:space="preserve">3.9 ALARM TRENDS</w:t>
       </w:r>
     </w:p>
     <w:p>
@@ -1164,19 +1179,7 @@
           <w:sz w:val="20"/>
           <w:szCs w:val="20"/>
         </w:rPr>
-        <w:t xml:space="preserve">{@calibrationXml}</w:t>
-      </w:r>
-    </w:p>
-    <w:p>
-      <w:pPr>
-        <w:spacing w:before="80" w:after="80"/>
-      </w:pPr>
-      <w:r>
-        <w:rPr>
-          <w:sz w:val="20"/>
-          <w:szCs w:val="20"/>
-        </w:rPr>
-        <w:t xml:space="preserve">{@calibrationTableXml}</w:t>
+        <w:t xml:space="preserve">{@alarmXml}</w:t>
       </w:r>
     </w:p>
     <w:p>
@@ -1190,7 +1193,7 @@
           <w:sz w:val="22"/>
           <w:szCs w:val="22"/>
         </w:rPr>
-        <w:t xml:space="preserve">3.9 PREVENTIVE MAINTENANCE</w:t>
+        <w:t xml:space="preserve">3.9.1 ALARM TREND SUMMARY</w:t>
       </w:r>
     </w:p>
     <w:p>
@@ -1202,7 +1205,7 @@
           <w:sz w:val="20"/>
           <w:szCs w:val="20"/>
         </w:rPr>
-        <w:t xml:space="preserve">{@preventiveMaintenanceXml}</w:t>
+        <w:t xml:space="preserve">{@alarmTrendXml}</w:t>
       </w:r>
     </w:p>
     <w:p>
@@ -1214,7 +1217,7 @@
           <w:sz w:val="20"/>
           <w:szCs w:val="20"/>
         </w:rPr>
-        <w:t xml:space="preserve">{@preventiveMaintenanceTableXml}</w:t>
+        <w:t xml:space="preserve">{@alarmTableXml}</w:t>
       </w:r>
     </w:p>
     <w:p>
@@ -1228,7 +1231,7 @@
           <w:sz w:val="22"/>
           <w:szCs w:val="22"/>
         </w:rPr>
-        <w:t xml:space="preserve">3.10 BREAKDOWNS AND TRENDS</w:t>
+        <w:t xml:space="preserve">3.10 MONITORING</w:t>
       </w:r>
     </w:p>
     <w:p>
@@ -1240,7 +1243,19 @@
           <w:sz w:val="20"/>
           <w:szCs w:val="20"/>
         </w:rPr>
-        <w:t xml:space="preserve">{@breakdownXml}</w:t>
+        <w:t xml:space="preserve">{@monitoringXml}</w:t>
+      </w:r>
+    </w:p>
+    <w:p>
+      <w:pPr>
+        <w:spacing w:before="80" w:after="80"/>
+      </w:pPr>
+      <w:r>
+        <w:rPr>
+          <w:sz w:val="20"/>
+          <w:szCs w:val="20"/>
+        </w:rPr>
+        <w:t xml:space="preserve">{@monitoringTableXml}</w:t>
       </w:r>
     </w:p>
     <w:p>
@@ -1254,7 +1269,7 @@
           <w:sz w:val="22"/>
           <w:szCs w:val="22"/>
         </w:rPr>
-        <w:t xml:space="preserve">3.10.1 BREAKDOWN TREND SUMMARY</w:t>
+        <w:t xml:space="preserve">3.11 CALIBRATION OF ASSOCIATED INSTRUMENTS</w:t>
       </w:r>
     </w:p>
     <w:p>
@@ -1266,7 +1281,7 @@
           <w:sz w:val="20"/>
           <w:szCs w:val="20"/>
         </w:rPr>
-        <w:t xml:space="preserve">{@breakdownTrendXml}</w:t>
+        <w:t xml:space="preserve">{@calibrationXml}</w:t>
       </w:r>
     </w:p>
     <w:p>
@@ -1278,7 +1293,7 @@
           <w:sz w:val="20"/>
           <w:szCs w:val="20"/>
         </w:rPr>
-        <w:t xml:space="preserve">{@breakdownTableXml}</w:t>
+        <w:t xml:space="preserve">{@calibrationTableXml}</w:t>
       </w:r>
     </w:p>
     <w:p>
@@ -1292,7 +1307,7 @@
           <w:sz w:val="22"/>
           <w:szCs w:val="22"/>
         </w:rPr>
-        <w:t xml:space="preserve">3.11 QMS RECORDS SINCE LAST PERIODIC RE-QUALIFICATION</w:t>
+        <w:t xml:space="preserve">3.12 PREVENTIVE MAINTENANCE</w:t>
       </w:r>
     </w:p>
     <w:p>
@@ -1304,7 +1319,7 @@
           <w:sz w:val="20"/>
           <w:szCs w:val="20"/>
         </w:rPr>
-        <w:t xml:space="preserve">{@qmsXml}</w:t>
+        <w:t xml:space="preserve">{@preventiveMaintenanceXml}</w:t>
       </w:r>
     </w:p>
     <w:p>
@@ -1316,7 +1331,7 @@
           <w:sz w:val="20"/>
           <w:szCs w:val="20"/>
         </w:rPr>
-        <w:t xml:space="preserve">{@qmsTableXml}</w:t>
+        <w:t xml:space="preserve">{@preventiveMaintenanceTableXml}</w:t>
       </w:r>
     </w:p>
     <w:p>
@@ -1330,7 +1345,7 @@
           <w:sz w:val="22"/>
           <w:szCs w:val="22"/>
         </w:rPr>
-        <w:t xml:space="preserve">3.12 ACCESS CONTROL</w:t>
+        <w:t xml:space="preserve">3.13 BREAKDOWNS AND TRENDS</w:t>
       </w:r>
     </w:p>
     <w:p>
@@ -1342,19 +1357,7 @@
           <w:sz w:val="20"/>
           <w:szCs w:val="20"/>
         </w:rPr>
-        <w:t xml:space="preserve">{@accessControlXml}</w:t>
-      </w:r>
-    </w:p>
-    <w:p>
-      <w:pPr>
-        <w:spacing w:before="80" w:after="80"/>
-      </w:pPr>
-      <w:r>
-        <w:rPr>
-          <w:sz w:val="20"/>
-          <w:szCs w:val="20"/>
-        </w:rPr>
-        <w:t xml:space="preserve">{@accessControlTableXml}</w:t>
+        <w:t xml:space="preserve">{@breakdownXml}</w:t>
       </w:r>
     </w:p>
     <w:p>
@@ -1368,7 +1371,7 @@
           <w:sz w:val="22"/>
           <w:szCs w:val="22"/>
         </w:rPr>
-        <w:t xml:space="preserve">3.13 AUDIT TRAIL REVIEW</w:t>
+        <w:t xml:space="preserve">3.13.1 BREAKDOWN TREND SUMMARY</w:t>
       </w:r>
     </w:p>
     <w:p>
@@ -1380,7 +1383,7 @@
           <w:sz w:val="20"/>
           <w:szCs w:val="20"/>
         </w:rPr>
-        <w:t xml:space="preserve">{@auditTrailXml}</w:t>
+        <w:t xml:space="preserve">{@breakdownTrendXml}</w:t>
       </w:r>
     </w:p>
     <w:p>
@@ -1392,7 +1395,7 @@
           <w:sz w:val="20"/>
           <w:szCs w:val="20"/>
         </w:rPr>
-        <w:t xml:space="preserve">{@auditTrailTableXml}</w:t>
+        <w:t xml:space="preserve">{@breakdownTableXml}</w:t>
       </w:r>
     </w:p>
     <w:p>
@@ -1406,7 +1409,121 @@
           <w:sz w:val="22"/>
           <w:szCs w:val="22"/>
         </w:rPr>
-        <w:t xml:space="preserve">3.14 COMPUTERIZED SYSTEM VALIDATION STATUS</w:t>
+        <w:t xml:space="preserve">3.14 QMS RECORDS SINCE LAST PERIODIC RE-QUALIFICATION</w:t>
+      </w:r>
+    </w:p>
+    <w:p>
+      <w:pPr>
+        <w:spacing w:before="80" w:after="80"/>
+      </w:pPr>
+      <w:r>
+        <w:rPr>
+          <w:sz w:val="20"/>
+          <w:szCs w:val="20"/>
+        </w:rPr>
+        <w:t xml:space="preserve">{@qmsXml}</w:t>
+      </w:r>
+    </w:p>
+    <w:p>
+      <w:pPr>
+        <w:spacing w:before="80" w:after="80"/>
+      </w:pPr>
+      <w:r>
+        <w:rPr>
+          <w:sz w:val="20"/>
+          <w:szCs w:val="20"/>
+        </w:rPr>
+        <w:t xml:space="preserve">{@qmsTableXml}</w:t>
+      </w:r>
+    </w:p>
+    <w:p>
+      <w:pPr>
+        <w:spacing w:before="200" w:after="80"/>
+      </w:pPr>
+      <w:r>
+        <w:rPr>
+          <w:b/>
+          <w:bCs/>
+          <w:sz w:val="22"/>
+          <w:szCs w:val="22"/>
+        </w:rPr>
+        <w:t xml:space="preserve">3.15 ACCESS CONTROL</w:t>
+      </w:r>
+    </w:p>
+    <w:p>
+      <w:pPr>
+        <w:spacing w:before="80" w:after="80"/>
+      </w:pPr>
+      <w:r>
+        <w:rPr>
+          <w:sz w:val="20"/>
+          <w:szCs w:val="20"/>
+        </w:rPr>
+        <w:t xml:space="preserve">{@accessControlXml}</w:t>
+      </w:r>
+    </w:p>
+    <w:p>
+      <w:pPr>
+        <w:spacing w:before="80" w:after="80"/>
+      </w:pPr>
+      <w:r>
+        <w:rPr>
+          <w:sz w:val="20"/>
+          <w:szCs w:val="20"/>
+        </w:rPr>
+        <w:t xml:space="preserve">{@accessControlTableXml}</w:t>
+      </w:r>
+    </w:p>
+    <w:p>
+      <w:pPr>
+        <w:spacing w:before="200" w:after="80"/>
+      </w:pPr>
+      <w:r>
+        <w:rPr>
+          <w:b/>
+          <w:bCs/>
+          <w:sz w:val="22"/>
+          <w:szCs w:val="22"/>
+        </w:rPr>
+        <w:t xml:space="preserve">3.16 AUDIT TRAIL REVIEW</w:t>
+      </w:r>
+    </w:p>
+    <w:p>
+      <w:pPr>
+        <w:spacing w:before="80" w:after="80"/>
+      </w:pPr>
+      <w:r>
+        <w:rPr>
+          <w:sz w:val="20"/>
+          <w:szCs w:val="20"/>
+        </w:rPr>
+        <w:t xml:space="preserve">{@auditTrailXml}</w:t>
+      </w:r>
+    </w:p>
+    <w:p>
+      <w:pPr>
+        <w:spacing w:before="80" w:after="80"/>
+      </w:pPr>
+      <w:r>
+        <w:rPr>
+          <w:sz w:val="20"/>
+          <w:szCs w:val="20"/>
+        </w:rPr>
+        <w:t xml:space="preserve">{@auditTrailTableXml}</w:t>
+      </w:r>
+    </w:p>
+    <w:p>
+      <w:pPr>
+        <w:spacing w:before="200" w:after="80"/>
+      </w:pPr>
+      <w:r>
+        <w:rPr>
+          <w:b/>
+          <w:bCs/>
+          <w:sz w:val="22"/>
+          <w:szCs w:val="22"/>
+        </w:rPr>
+        <w:t xml:space="preserve">3.17 COMPUTERIZED SYSTEM VALIDATION STATUS</w:t>
       </w:r>
     </w:p>
     <w:p>

</xml_diff>